<commit_message>
Regenerate Word exports from latest markdown briefs.
Refresh docx for Drive sharing; sources are *-BRIEF.md and planning/DECISIONS.md.

Co-authored-by: Cursor <cursoragent@cursor.com>
</commit_message>
<xml_diff>
--- a/docs/AUTOMATION-BRIEF.docx
+++ b/docs/AUTOMATION-BRIEF.docx
@@ -2,7 +2,7 @@
 <file path=word/document.xml><?xml version="1.0" encoding="utf-8"?>
 <w:document xmlns:w="http://schemas.openxmlformats.org/wordprocessingml/2006/main" xmlns:m="http://schemas.openxmlformats.org/officeDocument/2006/math" xmlns:r="http://schemas.openxmlformats.org/officeDocument/2006/relationships" xmlns:o="urn:schemas-microsoft-com:office:office" xmlns:v="urn:schemas-microsoft-com:vml" xmlns:w10="urn:schemas-microsoft-com:office:word" xmlns:a="http://schemas.openxmlformats.org/drawingml/2006/main" xmlns:pic="http://schemas.openxmlformats.org/drawingml/2006/picture" xmlns:wp="http://schemas.openxmlformats.org/drawingml/2006/wordprocessingDrawing">
   <w:body>
-    <w:bookmarkStart w:id="37" w:name="X412b8928c04e7bb54639bcb0e86af9a2be153ae"/>
+    <w:bookmarkStart w:id="38" w:name="X412b8928c04e7bb54639bcb0e86af9a2be153ae"/>
     <w:p>
       <w:pPr>
         <w:pStyle w:val="Heading1"/>
@@ -47,7 +47,7 @@
         <w:t xml:space="preserve"> </w:t>
       </w:r>
       <w:r>
-        <w:t xml:space="preserve">· Sr. System Admin, Full Stack AI Engineer · The Contentment Foundation</w:t>
+        <w:t xml:space="preserve">· somesh@contentment.org · Sr. System Admin, Full Stack AI Engineer · The Contentment Foundation</w:t>
       </w:r>
     </w:p>
     <w:p>
@@ -7759,13 +7759,42 @@
       </w:r>
     </w:p>
     <w:bookmarkEnd w:id="32"/>
-    <w:bookmarkStart w:id="33" w:name="full-environment-variable-reference"/>
+    <w:bookmarkStart w:id="34" w:name="full-environment-variable-reference"/>
     <w:p>
       <w:pPr>
         <w:pStyle w:val="Heading2"/>
       </w:pPr>
       <w:r>
         <w:t xml:space="preserve">Full Environment Variable Reference</w:t>
+      </w:r>
+    </w:p>
+    <w:p>
+      <w:pPr>
+        <w:pStyle w:val="BlockText"/>
+      </w:pPr>
+      <w:r>
+        <w:rPr>
+          <w:b/>
+          <w:bCs/>
+        </w:rPr>
+        <w:t xml:space="preserve">Canonical table:</w:t>
+      </w:r>
+      <w:r>
+        <w:t xml:space="preserve"> </w:t>
+      </w:r>
+      <w:hyperlink r:id="rId33">
+        <w:r>
+          <w:rPr>
+            <w:rStyle w:val="Hyperlink"/>
+          </w:rPr>
+          <w:t xml:space="preserve">TECHNICAL-ARCHITECTURE.md §6</w:t>
+        </w:r>
+      </w:hyperlink>
+      <w:r>
+        <w:t xml:space="preserve"> </w:t>
+      </w:r>
+      <w:r>
+        <w:t xml:space="preserve">— all keys below are summarized there. Do not duplicate values in this file.</w:t>
       </w:r>
     </w:p>
     <w:p>
@@ -8113,8 +8142,8 @@
         </w:pict>
       </w:r>
     </w:p>
-    <w:bookmarkEnd w:id="33"/>
-    <w:bookmarkStart w:id="34" w:name="Xfa581fe6a33ea71c65c6290eb5ddfaec0857580"/>
+    <w:bookmarkEnd w:id="34"/>
+    <w:bookmarkStart w:id="35" w:name="Xfa581fe6a33ea71c65c6290eb5ddfaec0857580"/>
     <w:p>
       <w:pPr>
         <w:pStyle w:val="Heading2"/>
@@ -8264,8 +8293,8 @@
         </w:pict>
       </w:r>
     </w:p>
-    <w:bookmarkEnd w:id="34"/>
-    <w:bookmarkStart w:id="35" w:name="security-notes"/>
+    <w:bookmarkEnd w:id="35"/>
+    <w:bookmarkStart w:id="36" w:name="security-notes"/>
     <w:p>
       <w:pPr>
         <w:pStyle w:val="Heading2"/>
@@ -8395,8 +8424,8 @@
         </w:pict>
       </w:r>
     </w:p>
-    <w:bookmarkEnd w:id="35"/>
-    <w:bookmarkStart w:id="36" w:name="related-documents"/>
+    <w:bookmarkEnd w:id="36"/>
+    <w:bookmarkStart w:id="37" w:name="related-documents"/>
     <w:p>
       <w:pPr>
         <w:pStyle w:val="Heading2"/>
@@ -8612,8 +8641,8 @@
         </w:tc>
       </w:tr>
     </w:tbl>
-    <w:bookmarkEnd w:id="36"/>
     <w:bookmarkEnd w:id="37"/>
+    <w:bookmarkEnd w:id="38"/>
     <w:sectPr>
       <w:footnotePr>
         <w:numRestart w:val="eachSect"/>

</xml_diff>